<commit_message>
Instruction Memory modernization and project rename
</commit_message>
<xml_diff>
--- a/SystemVerilog_32-bit_CPU_RISC-V_Modernization.docx
+++ b/SystemVerilog_32-bit_CPU_RISC-V_Modernization.docx
@@ -1098,23 +1098,7 @@
           <w:szCs w:val="28"/>
           <w:lang w:val="en-US"/>
         </w:rPr>
-        <w:t xml:space="preserve">it also </w:t>
-      </w:r>
-      <w:r>
-        <w:rPr>
-          <w:sz w:val="28"/>
-          <w:szCs w:val="28"/>
-          <w:lang w:val="en-US"/>
-        </w:rPr>
-        <w:t xml:space="preserve">takes </w:t>
-      </w:r>
-      <w:r>
-        <w:rPr>
-          <w:sz w:val="28"/>
-          <w:szCs w:val="28"/>
-          <w:lang w:val="en-US"/>
-        </w:rPr>
-        <w:t>significant part in the other operations types (address, etc.) The main core idea and combinational logic has remained unchangeable, although commands codes, data types and their quantity w</w:t>
+        <w:t>it also takes significant part in the other operations types (address, etc.) The main core idea and combinational logic has remained unchangeable, although commands codes, data types and their quantity w</w:t>
       </w:r>
       <w:r>
         <w:rPr>
@@ -1402,6 +1386,79 @@
         </w:rPr>
         <w:t xml:space="preserve"> using operators above (full information can be found in “RISC-V Green Card”).</w:t>
       </w:r>
+      <w:r>
+        <w:rPr>
+          <w:sz w:val="28"/>
+          <w:szCs w:val="28"/>
+          <w:lang w:val="en-US"/>
+        </w:rPr>
+        <w:t xml:space="preserve"> </w:t>
+      </w:r>
+      <w:r>
+        <w:rPr>
+          <w:sz w:val="28"/>
+          <w:szCs w:val="28"/>
+          <w:lang w:val="en-US"/>
+        </w:rPr>
+        <w:t xml:space="preserve">All </w:t>
+      </w:r>
+      <w:r>
+        <w:rPr>
+          <w:sz w:val="28"/>
+          <w:szCs w:val="28"/>
+          <w:lang w:val="en-US"/>
+        </w:rPr>
+        <w:t xml:space="preserve">commands </w:t>
+      </w:r>
+      <w:r>
+        <w:rPr>
+          <w:sz w:val="28"/>
+          <w:szCs w:val="28"/>
+          <w:lang w:val="en-US"/>
+        </w:rPr>
+        <w:t>implementation</w:t>
+      </w:r>
+      <w:r>
+        <w:rPr>
+          <w:sz w:val="28"/>
+          <w:szCs w:val="28"/>
+          <w:lang w:val="en-US"/>
+        </w:rPr>
+        <w:t>s</w:t>
+      </w:r>
+      <w:r>
+        <w:rPr>
+          <w:sz w:val="28"/>
+          <w:szCs w:val="28"/>
+          <w:lang w:val="en-US"/>
+        </w:rPr>
+        <w:t xml:space="preserve"> and simulation verification results can be seen in </w:t>
+      </w:r>
+      <w:r>
+        <w:rPr>
+          <w:sz w:val="28"/>
+          <w:szCs w:val="28"/>
+          <w:lang w:val="en-US"/>
+        </w:rPr>
+        <w:t>ALU_tb</w:t>
+      </w:r>
+      <w:r>
+        <w:rPr>
+          <w:sz w:val="28"/>
+          <w:szCs w:val="28"/>
+          <w:lang w:val="en-US"/>
+        </w:rPr>
+        <w:t>.sv and in the simulation graph (Appendices).</w:t>
+      </w:r>
+    </w:p>
+    <w:p>
+      <w:pPr>
+        <w:rPr>
+          <w:sz w:val="28"/>
+          <w:szCs w:val="28"/>
+          <w:lang w:val="en-US"/>
+        </w:rPr>
+      </w:pPr>
     </w:p>
     <w:p>
       <w:pPr>
@@ -1505,7 +1562,16 @@
           <w:szCs w:val="28"/>
           <w:lang w:val="en-US"/>
         </w:rPr>
-        <w:t>In compliance with the RV32I RISC-V base integer specification, the Register File consists of 32 general-purpose registers (designated as x0 through x31), where each register is 32 bits wide.</w:t>
+        <w:t xml:space="preserve">In compliance with the RV32I RISC-V base integer specification, the Register File consists of 32 general-purpose registers (designated as x0 through x31), </w:t>
+      </w:r>
+      <w:r>
+        <w:rPr>
+          <w:sz w:val="28"/>
+          <w:szCs w:val="28"/>
+          <w:lang w:val="en-US"/>
+        </w:rPr>
+        <w:lastRenderedPageBreak/>
+        <w:t>where each register is 32 bits wide.</w:t>
       </w:r>
       <w:r>
         <w:rPr>
@@ -1528,29 +1594,357 @@
     <w:p>
       <w:pPr>
         <w:rPr>
-          <w:sz w:val="28"/>
-          <w:szCs w:val="28"/>
-          <w:lang w:val="en-US"/>
-        </w:rPr>
-      </w:pPr>
-    </w:p>
-    <w:p>
-      <w:pPr>
-        <w:rPr>
-          <w:sz w:val="28"/>
-          <w:szCs w:val="28"/>
-          <w:lang w:val="en-US"/>
-        </w:rPr>
-      </w:pPr>
-    </w:p>
-    <w:p>
-      <w:pPr>
-        <w:rPr>
-          <w:sz w:val="28"/>
-          <w:szCs w:val="28"/>
-          <w:lang w:val="en-US"/>
-        </w:rPr>
-      </w:pPr>
+          <w:b/>
+          <w:bCs/>
+          <w:sz w:val="28"/>
+          <w:szCs w:val="28"/>
+          <w:lang w:val="en-US"/>
+        </w:rPr>
+      </w:pPr>
+      <w:r>
+        <w:rPr>
+          <w:b/>
+          <w:bCs/>
+          <w:sz w:val="28"/>
+          <w:szCs w:val="28"/>
+          <w:lang w:val="en-US"/>
+        </w:rPr>
+        <w:t xml:space="preserve">3.3 </w:t>
+      </w:r>
+      <w:r>
+        <w:rPr>
+          <w:b/>
+          <w:bCs/>
+          <w:sz w:val="28"/>
+          <w:szCs w:val="28"/>
+          <w:lang w:val="en-US"/>
+        </w:rPr>
+        <w:t>Data Memory</w:t>
+      </w:r>
+    </w:p>
+    <w:p>
+      <w:pPr>
+        <w:rPr>
+          <w:sz w:val="28"/>
+          <w:szCs w:val="28"/>
+          <w:lang w:val="en-US"/>
+        </w:rPr>
+      </w:pPr>
+      <w:r>
+        <w:rPr>
+          <w:sz w:val="28"/>
+          <w:szCs w:val="28"/>
+          <w:lang w:val="en-US"/>
+        </w:rPr>
+        <w:t xml:space="preserve">The Data Memory is a critical component of the RV32I processor core, responsible for handling persistent data storage and load/store operations during program execution. Acting as the primary interface between the processor </w:t>
+      </w:r>
+      <w:proofErr w:type="spellStart"/>
+      <w:r>
+        <w:rPr>
+          <w:sz w:val="28"/>
+          <w:szCs w:val="28"/>
+          <w:lang w:val="en-US"/>
+        </w:rPr>
+        <w:t>datapath</w:t>
+      </w:r>
+      <w:proofErr w:type="spellEnd"/>
+      <w:r>
+        <w:rPr>
+          <w:sz w:val="28"/>
+          <w:szCs w:val="28"/>
+          <w:lang w:val="en-US"/>
+        </w:rPr>
+        <w:t xml:space="preserve"> and the memory subsystem, it supports flexible word and sub-word data manipulation required for executing complex software instructions </w:t>
+      </w:r>
+      <w:r>
+        <w:rPr>
+          <w:sz w:val="28"/>
+          <w:szCs w:val="28"/>
+          <w:lang w:val="en-US"/>
+        </w:rPr>
+        <w:t>and bytes operations</w:t>
+      </w:r>
+      <w:r>
+        <w:rPr>
+          <w:sz w:val="28"/>
+          <w:szCs w:val="28"/>
+          <w:lang w:val="en-US"/>
+        </w:rPr>
+        <w:t>.</w:t>
+      </w:r>
+    </w:p>
+    <w:p>
+      <w:pPr>
+        <w:rPr>
+          <w:b/>
+          <w:bCs/>
+          <w:sz w:val="28"/>
+          <w:szCs w:val="28"/>
+          <w:lang w:val="en-US"/>
+        </w:rPr>
+      </w:pPr>
+      <w:r>
+        <w:rPr>
+          <w:sz w:val="28"/>
+          <w:szCs w:val="28"/>
+          <w:lang w:val="en-US"/>
+        </w:rPr>
+        <w:t>In compliance with the RV32I RISC-V base architecture, the memory is structured as a word-addressable array of 32-bit words, where the upper address bits define the row index and the lower bits ([1:0]) represent the byte offset. To support fine-grained memory access, a dedicated 4-bit write-enable mask enables selective byte and half-word updates, ensuring the integrity of surrounding data within the same word. All implementation details and simulation verification results can be seen in Data_Memory.sv and in the simulation graph (Appendices).</w:t>
+      </w:r>
+      <w:r>
+        <w:rPr>
+          <w:sz w:val="28"/>
+          <w:szCs w:val="28"/>
+          <w:lang w:val="en-US"/>
+        </w:rPr>
+        <w:t xml:space="preserve"> </w:t>
+      </w:r>
+      <w:r>
+        <w:rPr>
+          <w:b/>
+          <w:bCs/>
+          <w:sz w:val="28"/>
+          <w:szCs w:val="28"/>
+          <w:lang w:val="en-US"/>
+        </w:rPr>
+        <w:t>! Read and write data values can be different in some parts due to implementation, namely, read operation gives full 32-bit value, while write data can</w:t>
+      </w:r>
+      <w:r>
+        <w:rPr>
+          <w:b/>
+          <w:bCs/>
+          <w:sz w:val="28"/>
+          <w:szCs w:val="28"/>
+          <w:lang w:val="en-US"/>
+        </w:rPr>
+        <w:t xml:space="preserve"> be written and checked only in some part of the full line</w:t>
+      </w:r>
+      <w:r>
+        <w:rPr>
+          <w:b/>
+          <w:bCs/>
+          <w:sz w:val="28"/>
+          <w:szCs w:val="28"/>
+          <w:lang w:val="en-US"/>
+        </w:rPr>
+        <w:t>!</w:t>
+      </w:r>
+    </w:p>
+    <w:p>
+      <w:pPr>
+        <w:rPr>
+          <w:sz w:val="28"/>
+          <w:szCs w:val="28"/>
+          <w:lang w:val="en-US"/>
+        </w:rPr>
+      </w:pPr>
+    </w:p>
+    <w:p>
+      <w:pPr>
+        <w:rPr>
+          <w:b/>
+          <w:bCs/>
+          <w:sz w:val="28"/>
+          <w:szCs w:val="28"/>
+          <w:lang w:val="en-US"/>
+        </w:rPr>
+      </w:pPr>
+      <w:r>
+        <w:rPr>
+          <w:b/>
+          <w:bCs/>
+          <w:sz w:val="28"/>
+          <w:szCs w:val="28"/>
+          <w:lang w:val="en-US"/>
+        </w:rPr>
+        <w:t>3.</w:t>
+      </w:r>
+      <w:r>
+        <w:rPr>
+          <w:b/>
+          <w:bCs/>
+          <w:sz w:val="28"/>
+          <w:szCs w:val="28"/>
+          <w:lang w:val="en-US"/>
+        </w:rPr>
+        <w:t>4</w:t>
+      </w:r>
+      <w:r>
+        <w:rPr>
+          <w:b/>
+          <w:bCs/>
+          <w:sz w:val="28"/>
+          <w:szCs w:val="28"/>
+          <w:lang w:val="en-US"/>
+        </w:rPr>
+        <w:t xml:space="preserve"> </w:t>
+      </w:r>
+      <w:r>
+        <w:rPr>
+          <w:b/>
+          <w:bCs/>
+          <w:sz w:val="28"/>
+          <w:szCs w:val="28"/>
+          <w:lang w:val="en-US"/>
+        </w:rPr>
+        <w:t>Instruction Memory</w:t>
+      </w:r>
+    </w:p>
+    <w:p>
+      <w:pPr>
+        <w:rPr>
+          <w:sz w:val="28"/>
+          <w:szCs w:val="28"/>
+          <w:lang w:val="en-US"/>
+        </w:rPr>
+      </w:pPr>
+      <w:r>
+        <w:rPr>
+          <w:sz w:val="28"/>
+          <w:szCs w:val="28"/>
+          <w:lang w:val="en-US"/>
+        </w:rPr>
+        <w:t xml:space="preserve">The </w:t>
+      </w:r>
+      <w:r>
+        <w:rPr>
+          <w:sz w:val="28"/>
+          <w:szCs w:val="28"/>
+          <w:lang w:val="en-US"/>
+        </w:rPr>
+        <w:t>Instruction</w:t>
+      </w:r>
+      <w:r>
+        <w:rPr>
+          <w:sz w:val="28"/>
+          <w:szCs w:val="28"/>
+          <w:lang w:val="en-US"/>
+        </w:rPr>
+        <w:t xml:space="preserve"> Memory is a critical component of the RV32I processor core, responsible for handling </w:t>
+      </w:r>
+      <w:r>
+        <w:rPr>
+          <w:sz w:val="28"/>
+          <w:szCs w:val="28"/>
+          <w:lang w:val="en-US"/>
+        </w:rPr>
+        <w:t>CPU instructions</w:t>
+      </w:r>
+      <w:r>
+        <w:rPr>
+          <w:sz w:val="28"/>
+          <w:szCs w:val="28"/>
+          <w:lang w:val="en-US"/>
+        </w:rPr>
+        <w:t xml:space="preserve">. Acting as </w:t>
+      </w:r>
+      <w:r>
+        <w:rPr>
+          <w:sz w:val="28"/>
+          <w:szCs w:val="28"/>
+          <w:lang w:val="en-US"/>
+        </w:rPr>
+        <w:t>instructions source for the processor</w:t>
+      </w:r>
+      <w:r>
+        <w:rPr>
+          <w:sz w:val="28"/>
+          <w:szCs w:val="28"/>
+          <w:lang w:val="en-US"/>
+        </w:rPr>
+        <w:t xml:space="preserve">, it supports </w:t>
+      </w:r>
+      <w:r>
+        <w:rPr>
+          <w:sz w:val="28"/>
+          <w:szCs w:val="28"/>
+          <w:lang w:val="en-US"/>
+        </w:rPr>
+        <w:t>only reading operation</w:t>
+      </w:r>
+      <w:r>
+        <w:rPr>
+          <w:sz w:val="28"/>
+          <w:szCs w:val="28"/>
+          <w:lang w:val="en-US"/>
+        </w:rPr>
+        <w:t xml:space="preserve"> and</w:t>
+      </w:r>
+      <w:r>
+        <w:rPr>
+          <w:sz w:val="28"/>
+          <w:szCs w:val="28"/>
+          <w:lang w:val="en-US"/>
+        </w:rPr>
+        <w:t xml:space="preserve"> data manipulation </w:t>
+      </w:r>
+      <w:r>
+        <w:rPr>
+          <w:sz w:val="28"/>
+          <w:szCs w:val="28"/>
+          <w:lang w:val="en-US"/>
+        </w:rPr>
+        <w:t>with the whole 32-bit words</w:t>
+      </w:r>
+      <w:r>
+        <w:rPr>
+          <w:sz w:val="28"/>
+          <w:szCs w:val="28"/>
+          <w:lang w:val="en-US"/>
+        </w:rPr>
+        <w:t>.</w:t>
+      </w:r>
+      <w:r>
+        <w:rPr>
+          <w:sz w:val="28"/>
+          <w:szCs w:val="28"/>
+          <w:lang w:val="en-US"/>
+        </w:rPr>
+        <w:t xml:space="preserve"> The memory is also separated by bytes according to RISC-V standard, which initially was based on von-Neumann architecture, but in this project the Harvard architecture is used.</w:t>
+      </w:r>
+    </w:p>
+    <w:p>
+      <w:pPr>
+        <w:rPr>
+          <w:b/>
+          <w:bCs/>
+          <w:sz w:val="28"/>
+          <w:szCs w:val="28"/>
+          <w:lang w:val="en-US"/>
+        </w:rPr>
+      </w:pPr>
+      <w:r>
+        <w:rPr>
+          <w:sz w:val="28"/>
+          <w:szCs w:val="28"/>
+          <w:lang w:val="en-US"/>
+        </w:rPr>
+        <w:t xml:space="preserve">All implementation details and simulation verification results can be seen in </w:t>
+      </w:r>
+      <w:r>
+        <w:rPr>
+          <w:sz w:val="28"/>
+          <w:szCs w:val="28"/>
+          <w:lang w:val="en-US"/>
+        </w:rPr>
+        <w:t>Instruction</w:t>
+      </w:r>
+      <w:r>
+        <w:rPr>
+          <w:sz w:val="28"/>
+          <w:szCs w:val="28"/>
+          <w:lang w:val="en-US"/>
+        </w:rPr>
+        <w:t>_Memory.sv and in the simulation graph (Appendices).</w:t>
+      </w:r>
+      <w:r>
+        <w:rPr>
+          <w:sz w:val="28"/>
+          <w:szCs w:val="28"/>
+          <w:lang w:val="en-US"/>
+        </w:rPr>
+        <w:t xml:space="preserve"> </w:t>
+      </w:r>
     </w:p>
     <w:p>
       <w:pPr>
@@ -1718,6 +2112,7 @@
         <w:rPr>
           <w:b/>
           <w:bCs/>
+          <w:noProof/>
           <w:sz w:val="40"/>
           <w:szCs w:val="40"/>
           <w:lang w:val="en-US"/>
@@ -1837,103 +2232,103 @@
           <w:szCs w:val="28"/>
           <w:lang w:val="en-US"/>
         </w:rPr>
+        <w:t>SUCCESS SLL: Expected result (  11628800) was received correctly</w:t>
+      </w:r>
+      <w:r>
+        <w:rPr>
+          <w:sz w:val="28"/>
+          <w:szCs w:val="28"/>
+          <w:lang w:val="en-US"/>
+        </w:rPr>
+        <w:br/>
+      </w:r>
+      <w:r>
+        <w:rPr>
+          <w:sz w:val="28"/>
+          <w:szCs w:val="28"/>
+          <w:lang w:val="en-US"/>
+        </w:rPr>
+        <w:t>SUCCESS STL: Expected result (         1) was received correctly</w:t>
+      </w:r>
+      <w:r>
+        <w:rPr>
+          <w:sz w:val="28"/>
+          <w:szCs w:val="28"/>
+          <w:lang w:val="en-US"/>
+        </w:rPr>
+        <w:br/>
+      </w:r>
+      <w:r>
+        <w:rPr>
+          <w:sz w:val="28"/>
+          <w:szCs w:val="28"/>
+          <w:lang w:val="en-US"/>
+        </w:rPr>
+        <w:t>SUCCESS STL: Expected result (         0) was received correctly</w:t>
+      </w:r>
+      <w:r>
+        <w:rPr>
+          <w:sz w:val="28"/>
+          <w:szCs w:val="28"/>
+          <w:lang w:val="en-US"/>
+        </w:rPr>
+        <w:br/>
+      </w:r>
+      <w:r>
+        <w:rPr>
+          <w:sz w:val="28"/>
+          <w:szCs w:val="28"/>
+          <w:lang w:val="en-US"/>
+        </w:rPr>
+        <w:t>SUCCESS STLU: Expected result (         1) was received correctly</w:t>
+      </w:r>
+      <w:r>
+        <w:rPr>
+          <w:sz w:val="28"/>
+          <w:szCs w:val="28"/>
+          <w:lang w:val="en-US"/>
+        </w:rPr>
+        <w:br/>
+      </w:r>
+      <w:r>
+        <w:rPr>
+          <w:sz w:val="28"/>
+          <w:szCs w:val="28"/>
+          <w:lang w:val="en-US"/>
+        </w:rPr>
+        <w:t>SUCCESS STLU: Expected result (         0) was received correctly</w:t>
+      </w:r>
+      <w:r>
+        <w:rPr>
+          <w:sz w:val="28"/>
+          <w:szCs w:val="28"/>
+          <w:lang w:val="en-US"/>
+        </w:rPr>
+        <w:br/>
+      </w:r>
+      <w:r>
+        <w:rPr>
+          <w:sz w:val="28"/>
+          <w:szCs w:val="28"/>
+          <w:lang w:val="en-US"/>
+        </w:rPr>
+        <w:t>SUCCESS XOR: Expected result (    438779) was received correctly</w:t>
+      </w:r>
+      <w:r>
+        <w:rPr>
+          <w:sz w:val="28"/>
+          <w:szCs w:val="28"/>
+          <w:lang w:val="en-US"/>
+        </w:rPr>
+        <w:br/>
+      </w:r>
+      <w:r>
+        <w:rPr>
+          <w:sz w:val="28"/>
+          <w:szCs w:val="28"/>
+          <w:lang w:val="en-US"/>
+        </w:rPr>
         <w:lastRenderedPageBreak/>
-        <w:t>SUCCESS SLL: Expected result (  11628800) was received correctly</w:t>
-      </w:r>
-      <w:r>
-        <w:rPr>
-          <w:sz w:val="28"/>
-          <w:szCs w:val="28"/>
-          <w:lang w:val="en-US"/>
-        </w:rPr>
-        <w:br/>
-      </w:r>
-      <w:r>
-        <w:rPr>
-          <w:sz w:val="28"/>
-          <w:szCs w:val="28"/>
-          <w:lang w:val="en-US"/>
-        </w:rPr>
-        <w:t>SUCCESS STL: Expected result (         1) was received correctly</w:t>
-      </w:r>
-      <w:r>
-        <w:rPr>
-          <w:sz w:val="28"/>
-          <w:szCs w:val="28"/>
-          <w:lang w:val="en-US"/>
-        </w:rPr>
-        <w:br/>
-      </w:r>
-      <w:r>
-        <w:rPr>
-          <w:sz w:val="28"/>
-          <w:szCs w:val="28"/>
-          <w:lang w:val="en-US"/>
-        </w:rPr>
-        <w:t>SUCCESS STL: Expected result (         0) was received correctly</w:t>
-      </w:r>
-      <w:r>
-        <w:rPr>
-          <w:sz w:val="28"/>
-          <w:szCs w:val="28"/>
-          <w:lang w:val="en-US"/>
-        </w:rPr>
-        <w:br/>
-      </w:r>
-      <w:r>
-        <w:rPr>
-          <w:sz w:val="28"/>
-          <w:szCs w:val="28"/>
-          <w:lang w:val="en-US"/>
-        </w:rPr>
-        <w:t>SUCCESS STLU: Expected result (         1) was received correctly</w:t>
-      </w:r>
-      <w:r>
-        <w:rPr>
-          <w:sz w:val="28"/>
-          <w:szCs w:val="28"/>
-          <w:lang w:val="en-US"/>
-        </w:rPr>
-        <w:br/>
-      </w:r>
-      <w:r>
-        <w:rPr>
-          <w:sz w:val="28"/>
-          <w:szCs w:val="28"/>
-          <w:lang w:val="en-US"/>
-        </w:rPr>
-        <w:t>SUCCESS STLU: Expected result (         0) was received correctly</w:t>
-      </w:r>
-      <w:r>
-        <w:rPr>
-          <w:sz w:val="28"/>
-          <w:szCs w:val="28"/>
-          <w:lang w:val="en-US"/>
-        </w:rPr>
-        <w:br/>
-      </w:r>
-      <w:r>
-        <w:rPr>
-          <w:sz w:val="28"/>
-          <w:szCs w:val="28"/>
-          <w:lang w:val="en-US"/>
-        </w:rPr>
-        <w:t>SUCCESS XOR: Expected result (    438779) was received correctly</w:t>
-      </w:r>
-      <w:r>
-        <w:rPr>
-          <w:sz w:val="28"/>
-          <w:szCs w:val="28"/>
-          <w:lang w:val="en-US"/>
-        </w:rPr>
-        <w:br/>
-      </w:r>
-      <w:r>
-        <w:rPr>
-          <w:sz w:val="28"/>
-          <w:szCs w:val="28"/>
-          <w:lang w:val="en-US"/>
-        </w:rPr>
         <w:t>SUCCESS XOR: Expected result (         0) was received correctly</w:t>
       </w:r>
       <w:r>
@@ -2274,6 +2669,292 @@
           <w:lang w:val="en-US"/>
         </w:rPr>
         <w:t xml:space="preserve"> unchanged</w:t>
+      </w:r>
+    </w:p>
+    <w:p>
+      <w:pPr>
+        <w:rPr>
+          <w:sz w:val="28"/>
+          <w:szCs w:val="28"/>
+          <w:lang w:val="en-US"/>
+        </w:rPr>
+      </w:pPr>
+    </w:p>
+    <w:p>
+      <w:pPr>
+        <w:rPr>
+          <w:b/>
+          <w:bCs/>
+          <w:sz w:val="28"/>
+          <w:szCs w:val="28"/>
+          <w:lang w:val="en-US"/>
+        </w:rPr>
+      </w:pPr>
+      <w:r>
+        <w:rPr>
+          <w:b/>
+          <w:bCs/>
+          <w:sz w:val="28"/>
+          <w:szCs w:val="28"/>
+          <w:lang w:val="en-US"/>
+        </w:rPr>
+        <w:t>Data Memory:</w:t>
+      </w:r>
+    </w:p>
+    <w:p>
+      <w:pPr>
+        <w:rPr>
+          <w:b/>
+          <w:bCs/>
+          <w:sz w:val="28"/>
+          <w:szCs w:val="28"/>
+          <w:lang w:val="en-US"/>
+        </w:rPr>
+      </w:pPr>
+      <w:r>
+        <w:rPr>
+          <w:b/>
+          <w:bCs/>
+          <w:noProof/>
+          <w:sz w:val="28"/>
+          <w:szCs w:val="28"/>
+          <w:lang w:val="en-US"/>
+        </w:rPr>
+        <w:drawing>
+          <wp:inline distT="0" distB="0" distL="0" distR="0" wp14:anchorId="6F2AAF37" wp14:editId="3B3B54A0">
+            <wp:extent cx="5940425" cy="1466850"/>
+            <wp:effectExtent l="0" t="0" r="3175" b="0"/>
+            <wp:docPr id="3" name="Picture 3"/>
+            <wp:cNvGraphicFramePr>
+              <a:graphicFrameLocks xmlns:a="http://schemas.openxmlformats.org/drawingml/2006/main" noChangeAspect="1"/>
+            </wp:cNvGraphicFramePr>
+            <a:graphic xmlns:a="http://schemas.openxmlformats.org/drawingml/2006/main">
+              <a:graphicData uri="http://schemas.openxmlformats.org/drawingml/2006/picture">
+                <pic:pic xmlns:pic="http://schemas.openxmlformats.org/drawingml/2006/picture">
+                  <pic:nvPicPr>
+                    <pic:cNvPr id="1" name=""/>
+                    <pic:cNvPicPr/>
+                  </pic:nvPicPr>
+                  <pic:blipFill>
+                    <a:blip r:embed="rId8"/>
+                    <a:stretch>
+                      <a:fillRect/>
+                    </a:stretch>
+                  </pic:blipFill>
+                  <pic:spPr>
+                    <a:xfrm>
+                      <a:off x="0" y="0"/>
+                      <a:ext cx="5940425" cy="1466850"/>
+                    </a:xfrm>
+                    <a:prstGeom prst="rect">
+                      <a:avLst/>
+                    </a:prstGeom>
+                  </pic:spPr>
+                </pic:pic>
+              </a:graphicData>
+            </a:graphic>
+          </wp:inline>
+        </w:drawing>
+      </w:r>
+    </w:p>
+    <w:p>
+      <w:pPr>
+        <w:rPr>
+          <w:sz w:val="28"/>
+          <w:szCs w:val="28"/>
+          <w:lang w:val="en-US"/>
+        </w:rPr>
+      </w:pPr>
+      <w:r>
+        <w:rPr>
+          <w:sz w:val="28"/>
+          <w:szCs w:val="28"/>
+          <w:lang w:val="en-US"/>
+        </w:rPr>
+        <w:t>SUCCESS: Expected data (        346) was written to the address word cell         1</w:t>
+      </w:r>
+      <w:r>
+        <w:rPr>
+          <w:sz w:val="28"/>
+          <w:szCs w:val="28"/>
+          <w:lang w:val="en-US"/>
+        </w:rPr>
+        <w:br/>
+      </w:r>
+      <w:r>
+        <w:rPr>
+          <w:sz w:val="28"/>
+          <w:szCs w:val="28"/>
+          <w:lang w:val="en-US"/>
+        </w:rPr>
+        <w:t>SUCCESS: Expected data (205) was written to the address byte cell 3</w:t>
+      </w:r>
+      <w:r>
+        <w:rPr>
+          <w:sz w:val="28"/>
+          <w:szCs w:val="28"/>
+          <w:lang w:val="en-US"/>
+        </w:rPr>
+        <w:br/>
+      </w:r>
+      <w:r>
+        <w:rPr>
+          <w:sz w:val="28"/>
+          <w:szCs w:val="28"/>
+          <w:lang w:val="en-US"/>
+        </w:rPr>
+        <w:t>SUCCESS: Expected data (59189) was written to the address byte cell 2 and 1</w:t>
+      </w:r>
+      <w:r>
+        <w:rPr>
+          <w:sz w:val="28"/>
+          <w:szCs w:val="28"/>
+          <w:lang w:val="en-US"/>
+        </w:rPr>
+        <w:br/>
+      </w:r>
+      <w:r>
+        <w:rPr>
+          <w:sz w:val="28"/>
+          <w:szCs w:val="28"/>
+          <w:lang w:val="en-US"/>
+        </w:rPr>
+        <w:t>SUCCESS: Expected data (59166) was written to the address byte cell 2 and 0</w:t>
+      </w:r>
+    </w:p>
+    <w:p>
+      <w:pPr>
+        <w:rPr>
+          <w:b/>
+          <w:bCs/>
+          <w:sz w:val="28"/>
+          <w:szCs w:val="28"/>
+          <w:lang w:val="en-US"/>
+        </w:rPr>
+      </w:pPr>
+      <w:r>
+        <w:rPr>
+          <w:b/>
+          <w:bCs/>
+          <w:sz w:val="28"/>
+          <w:szCs w:val="28"/>
+          <w:lang w:val="en-US"/>
+        </w:rPr>
+        <w:lastRenderedPageBreak/>
+        <w:t>Instruction Memory</w:t>
+      </w:r>
+      <w:r>
+        <w:rPr>
+          <w:b/>
+          <w:bCs/>
+          <w:sz w:val="28"/>
+          <w:szCs w:val="28"/>
+          <w:lang w:val="en-US"/>
+        </w:rPr>
+        <w:t>:</w:t>
+      </w:r>
+    </w:p>
+    <w:p>
+      <w:pPr>
+        <w:rPr>
+          <w:sz w:val="28"/>
+          <w:szCs w:val="28"/>
+          <w:lang w:val="en-US"/>
+        </w:rPr>
+      </w:pPr>
+      <w:r>
+        <w:rPr>
+          <w:b/>
+          <w:bCs/>
+          <w:sz w:val="28"/>
+          <w:szCs w:val="28"/>
+          <w:lang w:val="en-US"/>
+        </w:rPr>
+        <w:drawing>
+          <wp:inline distT="0" distB="0" distL="0" distR="0" wp14:anchorId="70D572FF" wp14:editId="53E6A89C">
+            <wp:extent cx="5940425" cy="1465580"/>
+            <wp:effectExtent l="0" t="0" r="3175" b="1270"/>
+            <wp:docPr id="4" name="Picture 4"/>
+            <wp:cNvGraphicFramePr>
+              <a:graphicFrameLocks xmlns:a="http://schemas.openxmlformats.org/drawingml/2006/main" noChangeAspect="1"/>
+            </wp:cNvGraphicFramePr>
+            <a:graphic xmlns:a="http://schemas.openxmlformats.org/drawingml/2006/main">
+              <a:graphicData uri="http://schemas.openxmlformats.org/drawingml/2006/picture">
+                <pic:pic xmlns:pic="http://schemas.openxmlformats.org/drawingml/2006/picture">
+                  <pic:nvPicPr>
+                    <pic:cNvPr id="1" name=""/>
+                    <pic:cNvPicPr/>
+                  </pic:nvPicPr>
+                  <pic:blipFill>
+                    <a:blip r:embed="rId9"/>
+                    <a:stretch>
+                      <a:fillRect/>
+                    </a:stretch>
+                  </pic:blipFill>
+                  <pic:spPr>
+                    <a:xfrm>
+                      <a:off x="0" y="0"/>
+                      <a:ext cx="5940425" cy="1465580"/>
+                    </a:xfrm>
+                    <a:prstGeom prst="rect">
+                      <a:avLst/>
+                    </a:prstGeom>
+                  </pic:spPr>
+                </pic:pic>
+              </a:graphicData>
+            </a:graphic>
+          </wp:inline>
+        </w:drawing>
+      </w:r>
+      <w:r>
+        <w:rPr>
+          <w:b/>
+          <w:bCs/>
+          <w:sz w:val="28"/>
+          <w:szCs w:val="28"/>
+          <w:lang w:val="en-US"/>
+        </w:rPr>
+        <w:br/>
+      </w:r>
+      <w:r>
+        <w:rPr>
+          <w:sz w:val="28"/>
+          <w:szCs w:val="28"/>
+          <w:lang w:val="en-US"/>
+        </w:rPr>
+        <w:t>SUCCESS: Expected data (     74668) is located in the address cell          0</w:t>
+      </w:r>
+      <w:r>
+        <w:rPr>
+          <w:sz w:val="28"/>
+          <w:szCs w:val="28"/>
+          <w:lang w:val="en-US"/>
+        </w:rPr>
+        <w:br/>
+      </w:r>
+      <w:r>
+        <w:rPr>
+          <w:sz w:val="28"/>
+          <w:szCs w:val="28"/>
+          <w:lang w:val="en-US"/>
+        </w:rPr>
+        <w:t>SUCCESS: Expected data (  11412247) is located in the address cell          4</w:t>
+      </w:r>
+      <w:r>
+        <w:rPr>
+          <w:sz w:val="28"/>
+          <w:szCs w:val="28"/>
+          <w:lang w:val="en-US"/>
+        </w:rPr>
+        <w:br/>
+      </w:r>
+      <w:r>
+        <w:rPr>
+          <w:sz w:val="28"/>
+          <w:szCs w:val="28"/>
+          <w:lang w:val="en-US"/>
+        </w:rPr>
+        <w:t>SUCCESS: Expected data (1193071392) is located in the address cell          8</w:t>
       </w:r>
     </w:p>
     <w:sectPr>

</xml_diff>

<commit_message>
Regsiter File synchronous modernization
Read operation became synchronous and is executed for 2 clk signals.
ALU small update.
Program Counter has been started.
</commit_message>
<xml_diff>
--- a/SystemVerilog_32-bit_CPU_RISC-V_Modernization.docx
+++ b/SystemVerilog_32-bit_CPU_RISC-V_Modernization.docx
@@ -1572,6 +1572,48 @@
         </w:rPr>
         <w:lastRenderedPageBreak/>
         <w:t>where each register is 32 bits wide.</w:t>
+      </w:r>
+      <w:r>
+        <w:rPr>
+          <w:sz w:val="28"/>
+          <w:szCs w:val="28"/>
+          <w:lang w:val="en-US"/>
+        </w:rPr>
+        <w:t xml:space="preserve"> </w:t>
+      </w:r>
+      <w:r>
+        <w:rPr>
+          <w:sz w:val="28"/>
+          <w:szCs w:val="28"/>
+          <w:lang w:val="en-US"/>
+        </w:rPr>
+        <w:t>Register read operation became synchronous and also is execute for 2</w:t>
+      </w:r>
+      <w:r>
+        <w:rPr>
+          <w:sz w:val="28"/>
+          <w:szCs w:val="28"/>
+          <w:lang w:val="en-US"/>
+        </w:rPr>
+        <w:t xml:space="preserve"> </w:t>
+      </w:r>
+      <w:proofErr w:type="spellStart"/>
+      <w:r>
+        <w:rPr>
+          <w:sz w:val="28"/>
+          <w:szCs w:val="28"/>
+          <w:lang w:val="en-US"/>
+        </w:rPr>
+        <w:t>clk</w:t>
+      </w:r>
+      <w:proofErr w:type="spellEnd"/>
+      <w:r>
+        <w:rPr>
+          <w:sz w:val="28"/>
+          <w:szCs w:val="28"/>
+          <w:lang w:val="en-US"/>
+        </w:rPr>
+        <w:t xml:space="preserve"> signals.</w:t>
       </w:r>
       <w:r>
         <w:rPr>
@@ -2513,15 +2555,14 @@
       </w:r>
       <w:r>
         <w:rPr>
-          <w:noProof/>
           <w:sz w:val="28"/>
           <w:szCs w:val="28"/>
           <w:lang w:val="en-US"/>
         </w:rPr>
         <w:drawing>
-          <wp:inline distT="0" distB="0" distL="0" distR="0" wp14:anchorId="49854EA3" wp14:editId="410706A0">
-            <wp:extent cx="5940425" cy="1710055"/>
-            <wp:effectExtent l="0" t="0" r="3175" b="4445"/>
+          <wp:inline distT="0" distB="0" distL="0" distR="0" wp14:anchorId="2CB405D1" wp14:editId="3D1EC4E7">
+            <wp:extent cx="5940425" cy="1898650"/>
+            <wp:effectExtent l="0" t="0" r="3175" b="6350"/>
             <wp:docPr id="1" name="Picture 1"/>
             <wp:cNvGraphicFramePr>
               <a:graphicFrameLocks xmlns:a="http://schemas.openxmlformats.org/drawingml/2006/main" noChangeAspect="1"/>
@@ -2542,7 +2583,7 @@
                   <pic:spPr>
                     <a:xfrm>
                       <a:off x="0" y="0"/>
-                      <a:ext cx="5940425" cy="1710055"/>
+                      <a:ext cx="5940425" cy="1898650"/>
                     </a:xfrm>
                     <a:prstGeom prst="rect">
                       <a:avLst/>
@@ -2577,23 +2618,7 @@
           <w:szCs w:val="28"/>
           <w:lang w:val="en-US"/>
         </w:rPr>
-        <w:t>k</w:t>
-      </w:r>
-      <w:r>
-        <w:rPr>
-          <w:sz w:val="28"/>
-          <w:szCs w:val="28"/>
-          <w:lang w:val="en-US"/>
-        </w:rPr>
-        <w:t>e</w:t>
-      </w:r>
-      <w:r>
-        <w:rPr>
-          <w:sz w:val="28"/>
-          <w:szCs w:val="28"/>
-          <w:lang w:val="en-US"/>
-        </w:rPr>
-        <w:t>eped</w:t>
+        <w:t>keeped</w:t>
       </w:r>
       <w:proofErr w:type="spellEnd"/>
       <w:r>
@@ -2643,23 +2668,7 @@
           <w:szCs w:val="28"/>
           <w:lang w:val="en-US"/>
         </w:rPr>
-        <w:t>k</w:t>
-      </w:r>
-      <w:r>
-        <w:rPr>
-          <w:sz w:val="28"/>
-          <w:szCs w:val="28"/>
-          <w:lang w:val="en-US"/>
-        </w:rPr>
-        <w:t>e</w:t>
-      </w:r>
-      <w:r>
-        <w:rPr>
-          <w:sz w:val="28"/>
-          <w:szCs w:val="28"/>
-          <w:lang w:val="en-US"/>
-        </w:rPr>
-        <w:t>eped</w:t>
+        <w:t>keeped</w:t>
       </w:r>
       <w:proofErr w:type="spellEnd"/>
       <w:r>
@@ -2669,6 +2678,58 @@
           <w:lang w:val="en-US"/>
         </w:rPr>
         <w:t xml:space="preserve"> unchanged</w:t>
+      </w:r>
+      <w:r>
+        <w:rPr>
+          <w:sz w:val="28"/>
+          <w:szCs w:val="28"/>
+          <w:lang w:val="en-US"/>
+        </w:rPr>
+        <w:br/>
+      </w:r>
+      <w:r>
+        <w:rPr>
+          <w:sz w:val="28"/>
+          <w:szCs w:val="28"/>
+          <w:lang w:val="en-US"/>
+        </w:rPr>
+        <w:t xml:space="preserve">SUCCESS: Both </w:t>
+      </w:r>
+      <w:proofErr w:type="spellStart"/>
+      <w:r>
+        <w:rPr>
+          <w:sz w:val="28"/>
+          <w:szCs w:val="28"/>
+          <w:lang w:val="en-US"/>
+        </w:rPr>
+        <w:t>registors</w:t>
+      </w:r>
+      <w:proofErr w:type="spellEnd"/>
+      <w:r>
+        <w:rPr>
+          <w:sz w:val="28"/>
+          <w:szCs w:val="28"/>
+          <w:lang w:val="en-US"/>
+        </w:rPr>
+        <w:t xml:space="preserve"> got and gave </w:t>
+      </w:r>
+      <w:proofErr w:type="spellStart"/>
+      <w:r>
+        <w:rPr>
+          <w:sz w:val="28"/>
+          <w:szCs w:val="28"/>
+          <w:lang w:val="en-US"/>
+        </w:rPr>
+        <w:t>rigth</w:t>
+      </w:r>
+      <w:proofErr w:type="spellEnd"/>
+      <w:r>
+        <w:rPr>
+          <w:sz w:val="28"/>
+          <w:szCs w:val="28"/>
+          <w:lang w:val="en-US"/>
+        </w:rPr>
+        <w:t xml:space="preserve"> data</w:t>
       </w:r>
     </w:p>
     <w:p>
@@ -2803,6 +2864,7 @@
           <w:szCs w:val="28"/>
           <w:lang w:val="en-US"/>
         </w:rPr>
+        <w:lastRenderedPageBreak/>
         <w:t>SUCCESS: Expected data (59189) was written to the address byte cell 2 and 1</w:t>
       </w:r>
       <w:r>
@@ -2840,7 +2902,6 @@
           <w:szCs w:val="28"/>
           <w:lang w:val="en-US"/>
         </w:rPr>
-        <w:lastRenderedPageBreak/>
         <w:t>Instruction Memory</w:t>
       </w:r>
       <w:r>
@@ -2866,6 +2927,7 @@
         <w:rPr>
           <w:b/>
           <w:bCs/>
+          <w:noProof/>
           <w:sz w:val="28"/>
           <w:szCs w:val="28"/>
           <w:lang w:val="en-US"/>

</xml_diff>

<commit_message>
Program Counter simulation finished
PC module simulation was finished.

CPU Parameters Config was extended and restructured.

# Delays  replaced to parameters.
</commit_message>
<xml_diff>
--- a/SystemVerilog_32-bit_CPU_RISC-V_Modernization.docx
+++ b/SystemVerilog_32-bit_CPU_RISC-V_Modernization.docx
@@ -2066,13 +2066,17 @@
     <w:p>
       <w:pPr>
         <w:rPr>
-          <w:sz w:val="28"/>
-          <w:szCs w:val="28"/>
-          <w:lang w:val="en-US"/>
-        </w:rPr>
-      </w:pPr>
-      <w:r>
-        <w:rPr>
+          <w:b/>
+          <w:bCs/>
+          <w:sz w:val="28"/>
+          <w:szCs w:val="28"/>
+          <w:lang w:val="en-US"/>
+        </w:rPr>
+      </w:pPr>
+      <w:r>
+        <w:rPr>
+          <w:b/>
+          <w:bCs/>
           <w:sz w:val="28"/>
           <w:szCs w:val="28"/>
           <w:lang w:val="en-US"/>
@@ -3155,6 +3159,7 @@
         <w:rPr>
           <w:b/>
           <w:bCs/>
+          <w:noProof/>
           <w:sz w:val="28"/>
           <w:szCs w:val="28"/>
           <w:lang w:val="en-US"/>
@@ -3395,6 +3400,343 @@
           <w:lang w:val="en-US"/>
         </w:rPr>
         <w:t>SUCCESS: Expected data (1193071392) is located in the address cell          8</w:t>
+      </w:r>
+    </w:p>
+    <w:p>
+      <w:pPr>
+        <w:rPr>
+          <w:sz w:val="28"/>
+          <w:szCs w:val="28"/>
+          <w:lang w:val="en-US"/>
+        </w:rPr>
+      </w:pPr>
+    </w:p>
+    <w:p>
+      <w:pPr>
+        <w:rPr>
+          <w:sz w:val="28"/>
+          <w:szCs w:val="28"/>
+          <w:lang w:val="en-US"/>
+        </w:rPr>
+      </w:pPr>
+      <w:r>
+        <w:rPr>
+          <w:b/>
+          <w:bCs/>
+          <w:sz w:val="28"/>
+          <w:szCs w:val="28"/>
+          <w:lang w:val="en-US"/>
+        </w:rPr>
+        <w:t>Program Counter:</w:t>
+      </w:r>
+      <w:r>
+        <w:rPr>
+          <w:b/>
+          <w:bCs/>
+          <w:sz w:val="28"/>
+          <w:szCs w:val="28"/>
+          <w:lang w:val="en-US"/>
+        </w:rPr>
+        <w:br/>
+      </w:r>
+      <w:r>
+        <w:rPr>
+          <w:sz w:val="28"/>
+          <w:szCs w:val="28"/>
+          <w:lang w:val="en-US"/>
+        </w:rPr>
+        <w:drawing>
+          <wp:inline distT="0" distB="0" distL="0" distR="0" wp14:anchorId="0ABD45E0" wp14:editId="384DEBE6">
+            <wp:extent cx="5940425" cy="2239010"/>
+            <wp:effectExtent l="0" t="0" r="3175" b="8890"/>
+            <wp:docPr id="3" name="Picture 3"/>
+            <wp:cNvGraphicFramePr>
+              <a:graphicFrameLocks xmlns:a="http://schemas.openxmlformats.org/drawingml/2006/main" noChangeAspect="1"/>
+            </wp:cNvGraphicFramePr>
+            <a:graphic xmlns:a="http://schemas.openxmlformats.org/drawingml/2006/main">
+              <a:graphicData uri="http://schemas.openxmlformats.org/drawingml/2006/picture">
+                <pic:pic xmlns:pic="http://schemas.openxmlformats.org/drawingml/2006/picture">
+                  <pic:nvPicPr>
+                    <pic:cNvPr id="1" name=""/>
+                    <pic:cNvPicPr/>
+                  </pic:nvPicPr>
+                  <pic:blipFill>
+                    <a:blip r:embed="rId10"/>
+                    <a:stretch>
+                      <a:fillRect/>
+                    </a:stretch>
+                  </pic:blipFill>
+                  <pic:spPr>
+                    <a:xfrm>
+                      <a:off x="0" y="0"/>
+                      <a:ext cx="5940425" cy="2239010"/>
+                    </a:xfrm>
+                    <a:prstGeom prst="rect">
+                      <a:avLst/>
+                    </a:prstGeom>
+                  </pic:spPr>
+                </pic:pic>
+              </a:graphicData>
+            </a:graphic>
+          </wp:inline>
+        </w:drawing>
+      </w:r>
+      <w:r>
+        <w:rPr>
+          <w:sz w:val="28"/>
+          <w:szCs w:val="28"/>
+          <w:lang w:val="en-US"/>
+        </w:rPr>
+        <w:br/>
+      </w:r>
+      <w:r>
+        <w:rPr>
+          <w:sz w:val="28"/>
+          <w:szCs w:val="28"/>
+          <w:lang w:val="en-US"/>
+        </w:rPr>
+        <w:t>SUCCESS: Expected instruction address (         4) was received correctly.</w:t>
+      </w:r>
+      <w:r>
+        <w:rPr>
+          <w:sz w:val="28"/>
+          <w:szCs w:val="28"/>
+          <w:lang w:val="en-US"/>
+        </w:rPr>
+        <w:br/>
+      </w:r>
+      <w:r>
+        <w:rPr>
+          <w:sz w:val="28"/>
+          <w:szCs w:val="28"/>
+          <w:lang w:val="en-US"/>
+        </w:rPr>
+        <w:t>SUCCESS: Expected instruction address, latched_return_instruction_address, auipc_offset_address (         8,         12,        408) were received correctly.</w:t>
+      </w:r>
+      <w:r>
+        <w:rPr>
+          <w:sz w:val="28"/>
+          <w:szCs w:val="28"/>
+          <w:lang w:val="en-US"/>
+        </w:rPr>
+        <w:br/>
+      </w:r>
+      <w:r>
+        <w:rPr>
+          <w:sz w:val="28"/>
+          <w:szCs w:val="28"/>
+          <w:lang w:val="en-US"/>
+        </w:rPr>
+        <w:t>SUCCESS: Expected instruction address, latched_return_instruction_address (        52,         12) were received correctly.</w:t>
+      </w:r>
+      <w:r>
+        <w:rPr>
+          <w:sz w:val="28"/>
+          <w:szCs w:val="28"/>
+          <w:lang w:val="en-US"/>
+        </w:rPr>
+        <w:br/>
+      </w:r>
+      <w:r>
+        <w:rPr>
+          <w:sz w:val="28"/>
+          <w:szCs w:val="28"/>
+          <w:lang w:val="en-US"/>
+        </w:rPr>
+        <w:t>SUCCESS: Expected instruction address, latched_return_instruction_address (       244,         56) were received correctly.</w:t>
+      </w:r>
+      <w:r>
+        <w:rPr>
+          <w:sz w:val="28"/>
+          <w:szCs w:val="28"/>
+          <w:lang w:val="en-US"/>
+        </w:rPr>
+        <w:br/>
+      </w:r>
+      <w:r>
+        <w:rPr>
+          <w:sz w:val="28"/>
+          <w:szCs w:val="28"/>
+          <w:lang w:val="en-US"/>
+        </w:rPr>
+        <w:t>SUCCESS: Expected instruction address (        16) were received correctly.</w:t>
+      </w:r>
+      <w:r>
+        <w:rPr>
+          <w:sz w:val="28"/>
+          <w:szCs w:val="28"/>
+          <w:lang w:val="en-US"/>
+        </w:rPr>
+        <w:br/>
+      </w:r>
+      <w:r>
+        <w:rPr>
+          <w:sz w:val="28"/>
+          <w:szCs w:val="28"/>
+          <w:lang w:val="en-US"/>
+        </w:rPr>
+        <w:t>SUCCESS: Expected instruction address (        20) were received correctly.</w:t>
+      </w:r>
+      <w:r>
+        <w:rPr>
+          <w:sz w:val="28"/>
+          <w:szCs w:val="28"/>
+          <w:lang w:val="en-US"/>
+        </w:rPr>
+        <w:br/>
+      </w:r>
+      <w:r>
+        <w:rPr>
+          <w:sz w:val="28"/>
+          <w:szCs w:val="28"/>
+          <w:lang w:val="en-US"/>
+        </w:rPr>
+        <w:t>SUCCESS: Expected instruction address (        28) were received correctly.</w:t>
+      </w:r>
+      <w:r>
+        <w:rPr>
+          <w:sz w:val="28"/>
+          <w:szCs w:val="28"/>
+          <w:lang w:val="en-US"/>
+        </w:rPr>
+        <w:br/>
+      </w:r>
+      <w:r>
+        <w:rPr>
+          <w:sz w:val="28"/>
+          <w:szCs w:val="28"/>
+          <w:lang w:val="en-US"/>
+        </w:rPr>
+        <w:t>SUCCESS: Expected instruction address (        32) were received correctly.</w:t>
+      </w:r>
+      <w:r>
+        <w:rPr>
+          <w:sz w:val="28"/>
+          <w:szCs w:val="28"/>
+          <w:lang w:val="en-US"/>
+        </w:rPr>
+        <w:br/>
+      </w:r>
+      <w:r>
+        <w:rPr>
+          <w:sz w:val="28"/>
+          <w:szCs w:val="28"/>
+          <w:lang w:val="en-US"/>
+        </w:rPr>
+        <w:t>SUCCESS: Expected instruction address (        52) were received correctly.</w:t>
+      </w:r>
+      <w:r>
+        <w:rPr>
+          <w:sz w:val="28"/>
+          <w:szCs w:val="28"/>
+          <w:lang w:val="en-US"/>
+        </w:rPr>
+        <w:br/>
+      </w:r>
+      <w:r>
+        <w:rPr>
+          <w:sz w:val="28"/>
+          <w:szCs w:val="28"/>
+          <w:lang w:val="en-US"/>
+        </w:rPr>
+        <w:t>SUCCESS: Expected instruction address (        56) were received correctly.</w:t>
+      </w:r>
+      <w:r>
+        <w:rPr>
+          <w:sz w:val="28"/>
+          <w:szCs w:val="28"/>
+          <w:lang w:val="en-US"/>
+        </w:rPr>
+        <w:br/>
+      </w:r>
+      <w:r>
+        <w:rPr>
+          <w:sz w:val="28"/>
+          <w:szCs w:val="28"/>
+          <w:lang w:val="en-US"/>
+        </w:rPr>
+        <w:t>SUCCESS: Expected instruction address (        64) were received correctly.</w:t>
+      </w:r>
+      <w:r>
+        <w:rPr>
+          <w:sz w:val="28"/>
+          <w:szCs w:val="28"/>
+          <w:lang w:val="en-US"/>
+        </w:rPr>
+        <w:br/>
+      </w:r>
+      <w:r>
+        <w:rPr>
+          <w:sz w:val="28"/>
+          <w:szCs w:val="28"/>
+          <w:lang w:val="en-US"/>
+        </w:rPr>
+        <w:t>SUCCESS: Expected instruction address (        68) were received correctly.</w:t>
+      </w:r>
+      <w:r>
+        <w:rPr>
+          <w:sz w:val="28"/>
+          <w:szCs w:val="28"/>
+          <w:lang w:val="en-US"/>
+        </w:rPr>
+        <w:br/>
+      </w:r>
+      <w:r>
+        <w:rPr>
+          <w:sz w:val="28"/>
+          <w:szCs w:val="28"/>
+          <w:lang w:val="en-US"/>
+        </w:rPr>
+        <w:lastRenderedPageBreak/>
+        <w:t>SUCCESS: Expected instruction address (        80) were received correctly.</w:t>
+      </w:r>
+      <w:r>
+        <w:rPr>
+          <w:sz w:val="28"/>
+          <w:szCs w:val="28"/>
+          <w:lang w:val="en-US"/>
+        </w:rPr>
+        <w:br/>
+      </w:r>
+      <w:r>
+        <w:rPr>
+          <w:sz w:val="28"/>
+          <w:szCs w:val="28"/>
+          <w:lang w:val="en-US"/>
+        </w:rPr>
+        <w:t>SUCCESS: Expected instruction address (        84) were received correctly.</w:t>
+      </w:r>
+      <w:r>
+        <w:rPr>
+          <w:sz w:val="28"/>
+          <w:szCs w:val="28"/>
+          <w:lang w:val="en-US"/>
+        </w:rPr>
+        <w:br/>
+      </w:r>
+      <w:r>
+        <w:rPr>
+          <w:sz w:val="28"/>
+          <w:szCs w:val="28"/>
+          <w:lang w:val="en-US"/>
+        </w:rPr>
+        <w:t>SUCCESS: Expected instruction address (       100) were received correctly.</w:t>
+      </w:r>
+      <w:r>
+        <w:rPr>
+          <w:sz w:val="28"/>
+          <w:szCs w:val="28"/>
+          <w:lang w:val="en-US"/>
+        </w:rPr>
+        <w:br/>
+      </w:r>
+      <w:r>
+        <w:rPr>
+          <w:sz w:val="28"/>
+          <w:szCs w:val="28"/>
+          <w:lang w:val="en-US"/>
+        </w:rPr>
+        <w:t>SUCCESS: Expected instruction address (       104) were received correctly.</w:t>
       </w:r>
     </w:p>
     <w:sectPr>
@@ -4972,6 +5314,7 @@
   <w:style w:type="character" w:default="1" w:styleId="DefaultParagraphFont">
     <w:name w:val="Default Paragraph Font"/>
     <w:uiPriority w:val="1"/>
+    <w:semiHidden/>
     <w:unhideWhenUsed/>
   </w:style>
   <w:style w:type="table" w:default="1" w:styleId="TableNormal">

</xml_diff>